<commit_message>
Fix proposal page gap and survey checkbox spacing.
Keep signatures under the approval paragraph so the proposal sheet is one continuous page, and add padding around the survey and feedback checkboxes without changing the rest of the layout. Rebuild print-quality PDF and Word files.

Co-authored-by: omkeluskar <omkeluskar@users.noreply.github.com>
</commit_message>
<xml_diff>
--- a/cep-iot-bus-stop/chapters/CEP_Feedback_Questionnaire.docx
+++ b/cep-iot-bus-stop/chapters/CEP_Feedback_Questionnaire.docx
@@ -151,8 +151,17 @@
         <w:tc>
           <w:tcPr>
             <w:tcW w:type="dxa" w:w="10426"/>
+            <w:tcMar>
+              <w:top w:w="90" w:type="dxa"/>
+              <w:left w:w="120" w:type="dxa"/>
+              <w:bottom w:w="90" w:type="dxa"/>
+              <w:right w:w="120" w:type="dxa"/>
+            </w:tcMar>
           </w:tcPr>
           <w:p>
+            <w:pPr>
+              <w:spacing w:after="120" w:before="60"/>
+            </w:pPr>
             <w:r/>
             <w:r>
               <w:rPr>
@@ -165,6 +174,15 @@
             </w:r>
           </w:p>
           <w:p>
+            <w:pPr>
+              <w:tabs>
+                <w:tab w:pos="0" w:val="left"/>
+                <w:tab w:pos="2574" w:val="left"/>
+                <w:tab w:pos="5148" w:val="left"/>
+                <w:tab w:pos="7722" w:val="left"/>
+              </w:tabs>
+              <w:spacing w:before="80" w:after="80" w:line="276" w:lineRule="auto"/>
+            </w:pPr>
             <w:r>
               <w:rPr>
                 <w:rFonts w:ascii="Times New Roman" w:hAnsi="Times New Roman" w:eastAsia="Times New Roman"/>
@@ -172,7 +190,13 @@
                 <w:color w:val="000000"/>
                 <w:sz w:val="18"/>
               </w:rPr>
-              <w:t>☐  Very Easy     ☐  Easy     ☐  Neutral     ☐  Difficult</w:t>
+              <w:t>☐   Very Easy</w:t>
+              <w:tab/>
+              <w:t>☐   Easy</w:t>
+              <w:tab/>
+              <w:t>☐   Neutral</w:t>
+              <w:tab/>
+              <w:t>☐   Difficult</w:t>
             </w:r>
           </w:p>
         </w:tc>
@@ -181,8 +205,17 @@
         <w:tc>
           <w:tcPr>
             <w:tcW w:type="dxa" w:w="10426"/>
+            <w:tcMar>
+              <w:top w:w="90" w:type="dxa"/>
+              <w:left w:w="120" w:type="dxa"/>
+              <w:bottom w:w="90" w:type="dxa"/>
+              <w:right w:w="120" w:type="dxa"/>
+            </w:tcMar>
           </w:tcPr>
           <w:p>
+            <w:pPr>
+              <w:spacing w:after="120" w:before="60"/>
+            </w:pPr>
             <w:r/>
             <w:r>
               <w:rPr>
@@ -195,6 +228,15 @@
             </w:r>
           </w:p>
           <w:p>
+            <w:pPr>
+              <w:tabs>
+                <w:tab w:pos="0" w:val="left"/>
+                <w:tab w:pos="2574" w:val="left"/>
+                <w:tab w:pos="5148" w:val="left"/>
+                <w:tab w:pos="7722" w:val="left"/>
+              </w:tabs>
+              <w:spacing w:before="80" w:after="80" w:line="276" w:lineRule="auto"/>
+            </w:pPr>
             <w:r>
               <w:rPr>
                 <w:rFonts w:ascii="Times New Roman" w:hAnsi="Times New Roman" w:eastAsia="Times New Roman"/>
@@ -202,7 +244,13 @@
                 <w:color w:val="000000"/>
                 <w:sz w:val="18"/>
               </w:rPr>
-              <w:t>☐  Very Useful     ☐  Useful     ☐  Moderately Useful     ☐  Not Useful at All</w:t>
+              <w:t>☐   Very Useful</w:t>
+              <w:tab/>
+              <w:t>☐   Useful</w:t>
+              <w:tab/>
+              <w:t>☐   Moderately Useful</w:t>
+              <w:tab/>
+              <w:t>☐   Not Useful at All</w:t>
             </w:r>
           </w:p>
         </w:tc>
@@ -211,8 +259,17 @@
         <w:tc>
           <w:tcPr>
             <w:tcW w:type="dxa" w:w="10426"/>
+            <w:tcMar>
+              <w:top w:w="90" w:type="dxa"/>
+              <w:left w:w="120" w:type="dxa"/>
+              <w:bottom w:w="90" w:type="dxa"/>
+              <w:right w:w="120" w:type="dxa"/>
+            </w:tcMar>
           </w:tcPr>
           <w:p>
+            <w:pPr>
+              <w:spacing w:after="120" w:before="60"/>
+            </w:pPr>
             <w:r/>
             <w:r>
               <w:rPr>
@@ -225,6 +282,15 @@
             </w:r>
           </w:p>
           <w:p>
+            <w:pPr>
+              <w:tabs>
+                <w:tab w:pos="0" w:val="left"/>
+                <w:tab w:pos="2574" w:val="left"/>
+                <w:tab w:pos="5148" w:val="left"/>
+                <w:tab w:pos="7722" w:val="left"/>
+              </w:tabs>
+              <w:spacing w:before="80" w:after="80" w:line="276" w:lineRule="auto"/>
+            </w:pPr>
             <w:r>
               <w:rPr>
                 <w:rFonts w:ascii="Times New Roman" w:hAnsi="Times New Roman" w:eastAsia="Times New Roman"/>
@@ -232,7 +298,13 @@
                 <w:color w:val="000000"/>
                 <w:sz w:val="18"/>
               </w:rPr>
-              <w:t>☐  Very Clear     ☐  Clear     ☐  Neutral     ☐  Unclear</w:t>
+              <w:t>☐   Very Clear</w:t>
+              <w:tab/>
+              <w:t>☐   Clear</w:t>
+              <w:tab/>
+              <w:t>☐   Neutral</w:t>
+              <w:tab/>
+              <w:t>☐   Unclear</w:t>
             </w:r>
           </w:p>
         </w:tc>
@@ -241,8 +313,17 @@
         <w:tc>
           <w:tcPr>
             <w:tcW w:type="dxa" w:w="10426"/>
+            <w:tcMar>
+              <w:top w:w="90" w:type="dxa"/>
+              <w:left w:w="120" w:type="dxa"/>
+              <w:bottom w:w="90" w:type="dxa"/>
+              <w:right w:w="120" w:type="dxa"/>
+            </w:tcMar>
           </w:tcPr>
           <w:p>
+            <w:pPr>
+              <w:spacing w:after="120" w:before="60"/>
+            </w:pPr>
             <w:r/>
             <w:r>
               <w:rPr>
@@ -255,6 +336,15 @@
             </w:r>
           </w:p>
           <w:p>
+            <w:pPr>
+              <w:tabs>
+                <w:tab w:pos="0" w:val="left"/>
+                <w:tab w:pos="2574" w:val="left"/>
+                <w:tab w:pos="5148" w:val="left"/>
+                <w:tab w:pos="7722" w:val="left"/>
+              </w:tabs>
+              <w:spacing w:before="80" w:after="80" w:line="276" w:lineRule="auto"/>
+            </w:pPr>
             <w:r>
               <w:rPr>
                 <w:rFonts w:ascii="Times New Roman" w:hAnsi="Times New Roman" w:eastAsia="Times New Roman"/>
@@ -262,7 +352,13 @@
                 <w:color w:val="000000"/>
                 <w:sz w:val="18"/>
               </w:rPr>
-              <w:t>☐  Very Useful     ☐  Useful     ☐  Moderately Useful     ☐  Not Useful at All</w:t>
+              <w:t>☐   Very Useful</w:t>
+              <w:tab/>
+              <w:t>☐   Useful</w:t>
+              <w:tab/>
+              <w:t>☐   Moderately Useful</w:t>
+              <w:tab/>
+              <w:t>☐   Not Useful at All</w:t>
             </w:r>
           </w:p>
         </w:tc>
@@ -271,8 +367,17 @@
         <w:tc>
           <w:tcPr>
             <w:tcW w:type="dxa" w:w="10426"/>
+            <w:tcMar>
+              <w:top w:w="90" w:type="dxa"/>
+              <w:left w:w="120" w:type="dxa"/>
+              <w:bottom w:w="90" w:type="dxa"/>
+              <w:right w:w="120" w:type="dxa"/>
+            </w:tcMar>
           </w:tcPr>
           <w:p>
+            <w:pPr>
+              <w:spacing w:after="120" w:before="60"/>
+            </w:pPr>
             <w:r/>
             <w:r>
               <w:rPr>
@@ -285,6 +390,15 @@
             </w:r>
           </w:p>
           <w:p>
+            <w:pPr>
+              <w:tabs>
+                <w:tab w:pos="0" w:val="left"/>
+                <w:tab w:pos="2574" w:val="left"/>
+                <w:tab w:pos="5148" w:val="left"/>
+                <w:tab w:pos="7722" w:val="left"/>
+              </w:tabs>
+              <w:spacing w:before="80" w:after="80" w:line="276" w:lineRule="auto"/>
+            </w:pPr>
             <w:r>
               <w:rPr>
                 <w:rFonts w:ascii="Times New Roman" w:hAnsi="Times New Roman" w:eastAsia="Times New Roman"/>
@@ -292,7 +406,13 @@
                 <w:color w:val="000000"/>
                 <w:sz w:val="18"/>
               </w:rPr>
-              <w:t>☐  Very Useful     ☐  Useful     ☐  Moderately Useful     ☐  Not Useful at All</w:t>
+              <w:t>☐   Very Useful</w:t>
+              <w:tab/>
+              <w:t>☐   Useful</w:t>
+              <w:tab/>
+              <w:t>☐   Moderately Useful</w:t>
+              <w:tab/>
+              <w:t>☐   Not Useful at All</w:t>
             </w:r>
           </w:p>
         </w:tc>
@@ -301,8 +421,17 @@
         <w:tc>
           <w:tcPr>
             <w:tcW w:type="dxa" w:w="10426"/>
+            <w:tcMar>
+              <w:top w:w="90" w:type="dxa"/>
+              <w:left w:w="120" w:type="dxa"/>
+              <w:bottom w:w="90" w:type="dxa"/>
+              <w:right w:w="120" w:type="dxa"/>
+            </w:tcMar>
           </w:tcPr>
           <w:p>
+            <w:pPr>
+              <w:spacing w:after="120" w:before="60"/>
+            </w:pPr>
             <w:r/>
             <w:r>
               <w:rPr>
@@ -315,6 +444,15 @@
             </w:r>
           </w:p>
           <w:p>
+            <w:pPr>
+              <w:tabs>
+                <w:tab w:pos="0" w:val="left"/>
+                <w:tab w:pos="2574" w:val="left"/>
+                <w:tab w:pos="5148" w:val="left"/>
+                <w:tab w:pos="7722" w:val="left"/>
+              </w:tabs>
+              <w:spacing w:before="80" w:after="80" w:line="276" w:lineRule="auto"/>
+            </w:pPr>
             <w:r>
               <w:rPr>
                 <w:rFonts w:ascii="Times New Roman" w:hAnsi="Times New Roman" w:eastAsia="Times New Roman"/>
@@ -322,7 +460,13 @@
                 <w:color w:val="000000"/>
                 <w:sz w:val="18"/>
               </w:rPr>
-              <w:t>☐  Very Easy     ☐  Easy     ☐  Neutral     ☐  Difficult</w:t>
+              <w:t>☐   Very Easy</w:t>
+              <w:tab/>
+              <w:t>☐   Easy</w:t>
+              <w:tab/>
+              <w:t>☐   Neutral</w:t>
+              <w:tab/>
+              <w:t>☐   Difficult</w:t>
             </w:r>
           </w:p>
         </w:tc>
@@ -331,8 +475,17 @@
         <w:tc>
           <w:tcPr>
             <w:tcW w:type="dxa" w:w="10426"/>
+            <w:tcMar>
+              <w:top w:w="90" w:type="dxa"/>
+              <w:left w:w="120" w:type="dxa"/>
+              <w:bottom w:w="90" w:type="dxa"/>
+              <w:right w:w="120" w:type="dxa"/>
+            </w:tcMar>
           </w:tcPr>
           <w:p>
+            <w:pPr>
+              <w:spacing w:after="120" w:before="60"/>
+            </w:pPr>
             <w:r/>
             <w:r>
               <w:rPr>
@@ -345,6 +498,15 @@
             </w:r>
           </w:p>
           <w:p>
+            <w:pPr>
+              <w:tabs>
+                <w:tab w:pos="0" w:val="left"/>
+                <w:tab w:pos="2574" w:val="left"/>
+                <w:tab w:pos="5148" w:val="left"/>
+                <w:tab w:pos="7722" w:val="left"/>
+              </w:tabs>
+              <w:spacing w:before="80" w:after="80" w:line="276" w:lineRule="auto"/>
+            </w:pPr>
             <w:r>
               <w:rPr>
                 <w:rFonts w:ascii="Times New Roman" w:hAnsi="Times New Roman" w:eastAsia="Times New Roman"/>
@@ -352,7 +514,13 @@
                 <w:color w:val="000000"/>
                 <w:sz w:val="18"/>
               </w:rPr>
-              <w:t>☐  Very Clear     ☐  Clear     ☐  Neutral     ☐  Unclear</w:t>
+              <w:t>☐   Very Clear</w:t>
+              <w:tab/>
+              <w:t>☐   Clear</w:t>
+              <w:tab/>
+              <w:t>☐   Neutral</w:t>
+              <w:tab/>
+              <w:t>☐   Unclear</w:t>
             </w:r>
           </w:p>
         </w:tc>
@@ -361,8 +529,17 @@
         <w:tc>
           <w:tcPr>
             <w:tcW w:type="dxa" w:w="10426"/>
+            <w:tcMar>
+              <w:top w:w="90" w:type="dxa"/>
+              <w:left w:w="120" w:type="dxa"/>
+              <w:bottom w:w="90" w:type="dxa"/>
+              <w:right w:w="120" w:type="dxa"/>
+            </w:tcMar>
           </w:tcPr>
           <w:p>
+            <w:pPr>
+              <w:spacing w:after="120" w:before="60"/>
+            </w:pPr>
             <w:r/>
             <w:r>
               <w:rPr>
@@ -375,6 +552,15 @@
             </w:r>
           </w:p>
           <w:p>
+            <w:pPr>
+              <w:tabs>
+                <w:tab w:pos="0" w:val="left"/>
+                <w:tab w:pos="2574" w:val="left"/>
+                <w:tab w:pos="5148" w:val="left"/>
+                <w:tab w:pos="7722" w:val="left"/>
+              </w:tabs>
+              <w:spacing w:before="80" w:after="80" w:line="276" w:lineRule="auto"/>
+            </w:pPr>
             <w:r>
               <w:rPr>
                 <w:rFonts w:ascii="Times New Roman" w:hAnsi="Times New Roman" w:eastAsia="Times New Roman"/>
@@ -382,7 +568,13 @@
                 <w:color w:val="000000"/>
                 <w:sz w:val="18"/>
               </w:rPr>
-              <w:t>☐  Very Confident     ☐  Confident     ☐  Moderately Confident     ☐  Slightly Confident</w:t>
+              <w:t>☐   Very Confident</w:t>
+              <w:tab/>
+              <w:t>☐   Confident</w:t>
+              <w:tab/>
+              <w:t>☐   Moderately Confident</w:t>
+              <w:tab/>
+              <w:t>☐   Slightly Confident</w:t>
             </w:r>
           </w:p>
         </w:tc>
@@ -391,8 +583,17 @@
         <w:tc>
           <w:tcPr>
             <w:tcW w:type="dxa" w:w="10426"/>
+            <w:tcMar>
+              <w:top w:w="90" w:type="dxa"/>
+              <w:left w:w="120" w:type="dxa"/>
+              <w:bottom w:w="90" w:type="dxa"/>
+              <w:right w:w="120" w:type="dxa"/>
+            </w:tcMar>
           </w:tcPr>
           <w:p>
+            <w:pPr>
+              <w:spacing w:after="120" w:before="60"/>
+            </w:pPr>
             <w:r/>
             <w:r>
               <w:rPr>
@@ -405,6 +606,15 @@
             </w:r>
           </w:p>
           <w:p>
+            <w:pPr>
+              <w:tabs>
+                <w:tab w:pos="0" w:val="left"/>
+                <w:tab w:pos="2574" w:val="left"/>
+                <w:tab w:pos="5148" w:val="left"/>
+                <w:tab w:pos="7722" w:val="left"/>
+              </w:tabs>
+              <w:spacing w:before="80" w:after="80" w:line="276" w:lineRule="auto"/>
+            </w:pPr>
             <w:r>
               <w:rPr>
                 <w:rFonts w:ascii="Times New Roman" w:hAnsi="Times New Roman" w:eastAsia="Times New Roman"/>
@@ -412,7 +622,13 @@
                 <w:color w:val="000000"/>
                 <w:sz w:val="18"/>
               </w:rPr>
-              <w:t>☐  Definitely Yes     ☐  Probably Yes     ☐  Not Sure     ☐  Definitely No</w:t>
+              <w:t>☐   Definitely Yes</w:t>
+              <w:tab/>
+              <w:t>☐   Probably Yes</w:t>
+              <w:tab/>
+              <w:t>☐   Not Sure</w:t>
+              <w:tab/>
+              <w:t>☐   Definitely No</w:t>
             </w:r>
           </w:p>
         </w:tc>
@@ -421,8 +637,17 @@
         <w:tc>
           <w:tcPr>
             <w:tcW w:type="dxa" w:w="10426"/>
+            <w:tcMar>
+              <w:top w:w="90" w:type="dxa"/>
+              <w:left w:w="120" w:type="dxa"/>
+              <w:bottom w:w="90" w:type="dxa"/>
+              <w:right w:w="120" w:type="dxa"/>
+            </w:tcMar>
           </w:tcPr>
           <w:p>
+            <w:pPr>
+              <w:spacing w:after="120" w:before="60"/>
+            </w:pPr>
             <w:r/>
             <w:r>
               <w:rPr>
@@ -435,6 +660,15 @@
             </w:r>
           </w:p>
           <w:p>
+            <w:pPr>
+              <w:tabs>
+                <w:tab w:pos="0" w:val="left"/>
+                <w:tab w:pos="2574" w:val="left"/>
+                <w:tab w:pos="5148" w:val="left"/>
+                <w:tab w:pos="7722" w:val="left"/>
+              </w:tabs>
+              <w:spacing w:before="80" w:after="80" w:line="276" w:lineRule="auto"/>
+            </w:pPr>
             <w:r>
               <w:rPr>
                 <w:rFonts w:ascii="Times New Roman" w:hAnsi="Times New Roman" w:eastAsia="Times New Roman"/>
@@ -442,7 +676,13 @@
                 <w:color w:val="000000"/>
                 <w:sz w:val="18"/>
               </w:rPr>
-              <w:t>☐  Very Clear     ☐  Clear     ☐  Neutral     ☐  Unclear</w:t>
+              <w:t>☐   Very Clear</w:t>
+              <w:tab/>
+              <w:t>☐   Clear</w:t>
+              <w:tab/>
+              <w:t>☐   Neutral</w:t>
+              <w:tab/>
+              <w:t>☐   Unclear</w:t>
             </w:r>
           </w:p>
         </w:tc>
@@ -451,8 +691,17 @@
         <w:tc>
           <w:tcPr>
             <w:tcW w:type="dxa" w:w="10426"/>
+            <w:tcMar>
+              <w:top w:w="90" w:type="dxa"/>
+              <w:left w:w="120" w:type="dxa"/>
+              <w:bottom w:w="90" w:type="dxa"/>
+              <w:right w:w="120" w:type="dxa"/>
+            </w:tcMar>
           </w:tcPr>
           <w:p>
+            <w:pPr>
+              <w:spacing w:after="120" w:before="60"/>
+            </w:pPr>
             <w:r/>
             <w:r>
               <w:rPr>
@@ -465,6 +714,15 @@
             </w:r>
           </w:p>
           <w:p>
+            <w:pPr>
+              <w:tabs>
+                <w:tab w:pos="0" w:val="left"/>
+                <w:tab w:pos="2574" w:val="left"/>
+                <w:tab w:pos="5148" w:val="left"/>
+                <w:tab w:pos="7722" w:val="left"/>
+              </w:tabs>
+              <w:spacing w:before="80" w:after="80" w:line="276" w:lineRule="auto"/>
+            </w:pPr>
             <w:r>
               <w:rPr>
                 <w:rFonts w:ascii="Times New Roman" w:hAnsi="Times New Roman" w:eastAsia="Times New Roman"/>
@@ -472,7 +730,13 @@
                 <w:color w:val="000000"/>
                 <w:sz w:val="18"/>
               </w:rPr>
-              <w:t>☐  Very Useful     ☐  Useful     ☐  Moderately Useful     ☐  Not Useful at All</w:t>
+              <w:t>☐   Very Useful</w:t>
+              <w:tab/>
+              <w:t>☐   Useful</w:t>
+              <w:tab/>
+              <w:t>☐   Moderately Useful</w:t>
+              <w:tab/>
+              <w:t>☐   Not Useful at All</w:t>
             </w:r>
           </w:p>
         </w:tc>
@@ -481,8 +745,17 @@
         <w:tc>
           <w:tcPr>
             <w:tcW w:type="dxa" w:w="10426"/>
+            <w:tcMar>
+              <w:top w:w="90" w:type="dxa"/>
+              <w:left w:w="120" w:type="dxa"/>
+              <w:bottom w:w="90" w:type="dxa"/>
+              <w:right w:w="120" w:type="dxa"/>
+            </w:tcMar>
           </w:tcPr>
           <w:p>
+            <w:pPr>
+              <w:spacing w:after="120" w:before="60"/>
+            </w:pPr>
             <w:r/>
             <w:r>
               <w:rPr>
@@ -495,6 +768,15 @@
             </w:r>
           </w:p>
           <w:p>
+            <w:pPr>
+              <w:tabs>
+                <w:tab w:pos="0" w:val="left"/>
+                <w:tab w:pos="2574" w:val="left"/>
+                <w:tab w:pos="5148" w:val="left"/>
+                <w:tab w:pos="7722" w:val="left"/>
+              </w:tabs>
+              <w:spacing w:before="80" w:after="80" w:line="276" w:lineRule="auto"/>
+            </w:pPr>
             <w:r>
               <w:rPr>
                 <w:rFonts w:ascii="Times New Roman" w:hAnsi="Times New Roman" w:eastAsia="Times New Roman"/>
@@ -502,7 +784,13 @@
                 <w:color w:val="000000"/>
                 <w:sz w:val="18"/>
               </w:rPr>
-              <w:t>☐  Very Satisfied     ☐  Satisfied     ☐  Neutral     ☐  Dissatisfied</w:t>
+              <w:t>☐   Very Satisfied</w:t>
+              <w:tab/>
+              <w:t>☐   Satisfied</w:t>
+              <w:tab/>
+              <w:t>☐   Neutral</w:t>
+              <w:tab/>
+              <w:t>☐   Dissatisfied</w:t>
             </w:r>
           </w:p>
         </w:tc>

</xml_diff>

<commit_message>
Restore the original proposal and survey pages.
Use the college PDFs as-is: drop only the overlay frames that split the proposal sheet, and put feedback checkboxes next to their option labels. Do not redraw the layout.

Co-authored-by: omkeluskar <omkeluskar@users.noreply.github.com>
</commit_message>
<xml_diff>
--- a/cep-iot-bus-stop/chapters/CEP_Feedback_Questionnaire.docx
+++ b/cep-iot-bus-stop/chapters/CEP_Feedback_Questionnaire.docx
@@ -4,830 +4,52 @@
   <w:body>
     <w:p>
       <w:pPr>
+        <w:spacing w:before="0" w:after="0" w:line="240" w:lineRule="auto"/>
         <w:jc w:val="center"/>
       </w:pPr>
       <w:r>
-        <w:rPr>
-          <w:rFonts w:ascii="Times New Roman" w:hAnsi="Times New Roman" w:eastAsia="Times New Roman"/>
-          <w:b/>
-          <w:color w:val="000000"/>
-          <w:sz w:val="26"/>
-        </w:rPr>
-        <w:t>Nirmala Memorial Foundation College of Commerce and Science (Autonomous)</w:t>
+        <w:drawing>
+          <wp:inline xmlns:a="http://schemas.openxmlformats.org/drawingml/2006/main" xmlns:pic="http://schemas.openxmlformats.org/drawingml/2006/picture">
+            <wp:extent cx="7772400" cy="10058400"/>
+            <wp:docPr id="1" name="Picture 1"/>
+            <wp:cNvGraphicFramePr>
+              <a:graphicFrameLocks noChangeAspect="1"/>
+            </wp:cNvGraphicFramePr>
+            <a:graphic>
+              <a:graphicData uri="http://schemas.openxmlformats.org/drawingml/2006/picture">
+                <pic:pic>
+                  <pic:nvPicPr>
+                    <pic:cNvPr id="0" name="CEP_Feedback_Questionnaire_p1.png"/>
+                    <pic:cNvPicPr/>
+                  </pic:nvPicPr>
+                  <pic:blipFill>
+                    <a:blip r:embed="rId9"/>
+                    <a:stretch>
+                      <a:fillRect/>
+                    </a:stretch>
+                  </pic:blipFill>
+                  <pic:spPr>
+                    <a:xfrm>
+                      <a:off x="0" y="0"/>
+                      <a:ext cx="7772400" cy="10058400"/>
+                    </a:xfrm>
+                    <a:prstGeom prst="rect"/>
+                  </pic:spPr>
+                </pic:pic>
+              </a:graphicData>
+            </a:graphic>
+          </wp:inline>
+        </w:drawing>
       </w:r>
     </w:p>
-    <w:p>
-      <w:pPr>
-        <w:jc w:val="center"/>
-      </w:pPr>
-      <w:r>
-        <w:rPr>
-          <w:rFonts w:ascii="Times New Roman" w:hAnsi="Times New Roman" w:eastAsia="Times New Roman"/>
-          <w:b w:val="0"/>
-          <w:color w:val="000000"/>
-          <w:sz w:val="22"/>
-        </w:rPr>
-        <w:t>Department of Information Technology</w:t>
-      </w:r>
-    </w:p>
-    <w:p>
-      <w:pPr>
-        <w:jc w:val="center"/>
-      </w:pPr>
-      <w:r>
-        <w:rPr>
-          <w:rFonts w:ascii="Times New Roman" w:hAnsi="Times New Roman" w:eastAsia="Times New Roman"/>
-          <w:b/>
-          <w:color w:val="000000"/>
-          <w:sz w:val="22"/>
-        </w:rPr>
-        <w:t>Community Engagement Project Questionnaire</w:t>
-      </w:r>
-    </w:p>
-    <w:tbl>
-      <w:tblPr>
-        <w:tblStyle w:val="TableGrid"/>
-        <w:tblW w:type="auto" w:w="0"/>
-        <w:tblLook w:firstColumn="1" w:firstRow="1" w:lastColumn="0" w:lastRow="0" w:noHBand="0" w:noVBand="1" w:val="04A0"/>
-      </w:tblPr>
-      <w:tblGrid>
-        <w:gridCol w:w="5213"/>
-        <w:gridCol w:w="5213"/>
-      </w:tblGrid>
-      <w:tr>
-        <w:tc>
-          <w:tcPr>
-            <w:tcW w:type="dxa" w:w="5213"/>
-          </w:tcPr>
-          <w:p>
-            <w:r>
-              <w:rPr>
-                <w:rFonts w:ascii="Times New Roman" w:hAnsi="Times New Roman" w:eastAsia="Times New Roman"/>
-                <w:b w:val="0"/>
-                <w:color w:val="000000"/>
-                <w:sz w:val="20"/>
-              </w:rPr>
-              <w:t>Name of Student(s): Mr. Om Keluskar, Mr. Jashith Agre</w:t>
-            </w:r>
-          </w:p>
-        </w:tc>
-        <w:tc>
-          <w:tcPr>
-            <w:tcW w:type="dxa" w:w="5213"/>
-          </w:tcPr>
-          <w:p>
-            <w:r>
-              <w:rPr>
-                <w:rFonts w:ascii="Times New Roman" w:hAnsi="Times New Roman" w:eastAsia="Times New Roman"/>
-                <w:b w:val="0"/>
-                <w:color w:val="000000"/>
-                <w:sz w:val="20"/>
-              </w:rPr>
-              <w:t>Name of Participant: ____________________</w:t>
-            </w:r>
-          </w:p>
-        </w:tc>
-      </w:tr>
-      <w:tr>
-        <w:tc>
-          <w:tcPr>
-            <w:tcW w:type="dxa" w:w="5213"/>
-          </w:tcPr>
-          <w:p>
-            <w:r>
-              <w:rPr>
-                <w:rFonts w:ascii="Times New Roman" w:hAnsi="Times New Roman" w:eastAsia="Times New Roman"/>
-                <w:b w:val="0"/>
-                <w:color w:val="000000"/>
-                <w:sz w:val="20"/>
-              </w:rPr>
-              <w:t>Seat No: 24TIT078, 24TIT011</w:t>
-            </w:r>
-          </w:p>
-        </w:tc>
-        <w:tc>
-          <w:tcPr>
-            <w:tcW w:type="dxa" w:w="5213"/>
-          </w:tcPr>
-          <w:p>
-            <w:r>
-              <w:rPr>
-                <w:rFonts w:ascii="Times New Roman" w:hAnsi="Times New Roman" w:eastAsia="Times New Roman"/>
-                <w:b w:val="0"/>
-                <w:color w:val="000000"/>
-                <w:sz w:val="20"/>
-              </w:rPr>
-              <w:t>Signature of Participant: ____________________</w:t>
-            </w:r>
-          </w:p>
-        </w:tc>
-      </w:tr>
-    </w:tbl>
-    <w:p>
-      <w:pPr>
-        <w:jc w:val="center"/>
-      </w:pPr>
-      <w:r>
-        <w:rPr>
-          <w:rFonts w:ascii="Times New Roman" w:hAnsi="Times New Roman" w:eastAsia="Times New Roman"/>
-          <w:b/>
-          <w:color w:val="000000"/>
-          <w:sz w:val="28"/>
-        </w:rPr>
-        <w:t>Feedback Questionnaire</w:t>
-      </w:r>
-    </w:p>
-    <w:tbl>
-      <w:tblPr>
-        <w:tblStyle w:val="TableGrid"/>
-        <w:tblW w:type="auto" w:w="0"/>
-        <w:jc w:val="center"/>
-        <w:tblLook w:firstColumn="1" w:firstRow="1" w:lastColumn="0" w:lastRow="0" w:noHBand="0" w:noVBand="1" w:val="04A0"/>
-      </w:tblPr>
-      <w:tblGrid>
-        <w:gridCol w:w="10426"/>
-      </w:tblGrid>
-      <w:tr>
-        <w:tc>
-          <w:tcPr>
-            <w:tcW w:type="dxa" w:w="10426"/>
-            <w:tcMar>
-              <w:top w:w="90" w:type="dxa"/>
-              <w:left w:w="120" w:type="dxa"/>
-              <w:bottom w:w="90" w:type="dxa"/>
-              <w:right w:w="120" w:type="dxa"/>
-            </w:tcMar>
-          </w:tcPr>
-          <w:p>
-            <w:pPr>
-              <w:spacing w:after="120" w:before="60"/>
-            </w:pPr>
-            <w:r/>
-            <w:r>
-              <w:rPr>
-                <w:rFonts w:ascii="Times New Roman" w:hAnsi="Times New Roman" w:eastAsia="Times New Roman"/>
-                <w:b/>
-                <w:color w:val="000000"/>
-                <w:sz w:val="20"/>
-              </w:rPr>
-              <w:t>1. How easy was it to understand the purpose of the IoT bus-stop overcrowding system?</w:t>
-            </w:r>
-          </w:p>
-          <w:p>
-            <w:pPr>
-              <w:tabs>
-                <w:tab w:pos="0" w:val="left"/>
-                <w:tab w:pos="2574" w:val="left"/>
-                <w:tab w:pos="5148" w:val="left"/>
-                <w:tab w:pos="7722" w:val="left"/>
-              </w:tabs>
-              <w:spacing w:before="80" w:after="80" w:line="276" w:lineRule="auto"/>
-            </w:pPr>
-            <w:r>
-              <w:rPr>
-                <w:rFonts w:ascii="Times New Roman" w:hAnsi="Times New Roman" w:eastAsia="Times New Roman"/>
-                <w:b w:val="0"/>
-                <w:color w:val="000000"/>
-                <w:sz w:val="18"/>
-              </w:rPr>
-              <w:t>☐   Very Easy</w:t>
-              <w:tab/>
-              <w:t>☐   Easy</w:t>
-              <w:tab/>
-              <w:t>☐   Neutral</w:t>
-              <w:tab/>
-              <w:t>☐   Difficult</w:t>
-            </w:r>
-          </w:p>
-        </w:tc>
-      </w:tr>
-      <w:tr>
-        <w:tc>
-          <w:tcPr>
-            <w:tcW w:type="dxa" w:w="10426"/>
-            <w:tcMar>
-              <w:top w:w="90" w:type="dxa"/>
-              <w:left w:w="120" w:type="dxa"/>
-              <w:bottom w:w="90" w:type="dxa"/>
-              <w:right w:w="120" w:type="dxa"/>
-            </w:tcMar>
-          </w:tcPr>
-          <w:p>
-            <w:pPr>
-              <w:spacing w:after="120" w:before="60"/>
-            </w:pPr>
-            <w:r/>
-            <w:r>
-              <w:rPr>
-                <w:rFonts w:ascii="Times New Roman" w:hAnsi="Times New Roman" w:eastAsia="Times New Roman"/>
-                <w:b/>
-                <w:color w:val="000000"/>
-                <w:sz w:val="20"/>
-              </w:rPr>
-              <w:t>2. How useful do you think automatic passenger counting using the IoT sensor would be for overcrowding awareness?</w:t>
-            </w:r>
-          </w:p>
-          <w:p>
-            <w:pPr>
-              <w:tabs>
-                <w:tab w:pos="0" w:val="left"/>
-                <w:tab w:pos="2574" w:val="left"/>
-                <w:tab w:pos="5148" w:val="left"/>
-                <w:tab w:pos="7722" w:val="left"/>
-              </w:tabs>
-              <w:spacing w:before="80" w:after="80" w:line="276" w:lineRule="auto"/>
-            </w:pPr>
-            <w:r>
-              <w:rPr>
-                <w:rFonts w:ascii="Times New Roman" w:hAnsi="Times New Roman" w:eastAsia="Times New Roman"/>
-                <w:b w:val="0"/>
-                <w:color w:val="000000"/>
-                <w:sz w:val="18"/>
-              </w:rPr>
-              <w:t>☐   Very Useful</w:t>
-              <w:tab/>
-              <w:t>☐   Useful</w:t>
-              <w:tab/>
-              <w:t>☐   Moderately Useful</w:t>
-              <w:tab/>
-              <w:t>☐   Not Useful at All</w:t>
-            </w:r>
-          </w:p>
-        </w:tc>
-      </w:tr>
-      <w:tr>
-        <w:tc>
-          <w:tcPr>
-            <w:tcW w:type="dxa" w:w="10426"/>
-            <w:tcMar>
-              <w:top w:w="90" w:type="dxa"/>
-              <w:left w:w="120" w:type="dxa"/>
-              <w:bottom w:w="90" w:type="dxa"/>
-              <w:right w:w="120" w:type="dxa"/>
-            </w:tcMar>
-          </w:tcPr>
-          <w:p>
-            <w:pPr>
-              <w:spacing w:after="120" w:before="60"/>
-            </w:pPr>
-            <w:r/>
-            <w:r>
-              <w:rPr>
-                <w:rFonts w:ascii="Times New Roman" w:hAnsi="Times New Roman" w:eastAsia="Times New Roman"/>
-                <w:b/>
-                <w:color w:val="000000"/>
-                <w:sz w:val="20"/>
-              </w:rPr>
-              <w:t>3. How clear and understandable was the demonstrated overcrowding-prediction process?</w:t>
-            </w:r>
-          </w:p>
-          <w:p>
-            <w:pPr>
-              <w:tabs>
-                <w:tab w:pos="0" w:val="left"/>
-                <w:tab w:pos="2574" w:val="left"/>
-                <w:tab w:pos="5148" w:val="left"/>
-                <w:tab w:pos="7722" w:val="left"/>
-              </w:tabs>
-              <w:spacing w:before="80" w:after="80" w:line="276" w:lineRule="auto"/>
-            </w:pPr>
-            <w:r>
-              <w:rPr>
-                <w:rFonts w:ascii="Times New Roman" w:hAnsi="Times New Roman" w:eastAsia="Times New Roman"/>
-                <w:b w:val="0"/>
-                <w:color w:val="000000"/>
-                <w:sz w:val="18"/>
-              </w:rPr>
-              <w:t>☐   Very Clear</w:t>
-              <w:tab/>
-              <w:t>☐   Clear</w:t>
-              <w:tab/>
-              <w:t>☐   Neutral</w:t>
-              <w:tab/>
-              <w:t>☐   Unclear</w:t>
-            </w:r>
-          </w:p>
-        </w:tc>
-      </w:tr>
-      <w:tr>
-        <w:tc>
-          <w:tcPr>
-            <w:tcW w:type="dxa" w:w="10426"/>
-            <w:tcMar>
-              <w:top w:w="90" w:type="dxa"/>
-              <w:left w:w="120" w:type="dxa"/>
-              <w:bottom w:w="90" w:type="dxa"/>
-              <w:right w:w="120" w:type="dxa"/>
-            </w:tcMar>
-          </w:tcPr>
-          <w:p>
-            <w:pPr>
-              <w:spacing w:after="120" w:before="60"/>
-            </w:pPr>
-            <w:r/>
-            <w:r>
-              <w:rPr>
-                <w:rFonts w:ascii="Times New Roman" w:hAnsi="Times New Roman" w:eastAsia="Times New Roman"/>
-                <w:b/>
-                <w:color w:val="000000"/>
-                <w:sz w:val="20"/>
-              </w:rPr>
-              <w:t>4. How useful were the on-site red and green LED indicators for understanding crowding?</w:t>
-            </w:r>
-          </w:p>
-          <w:p>
-            <w:pPr>
-              <w:tabs>
-                <w:tab w:pos="0" w:val="left"/>
-                <w:tab w:pos="2574" w:val="left"/>
-                <w:tab w:pos="5148" w:val="left"/>
-                <w:tab w:pos="7722" w:val="left"/>
-              </w:tabs>
-              <w:spacing w:before="80" w:after="80" w:line="276" w:lineRule="auto"/>
-            </w:pPr>
-            <w:r>
-              <w:rPr>
-                <w:rFonts w:ascii="Times New Roman" w:hAnsi="Times New Roman" w:eastAsia="Times New Roman"/>
-                <w:b w:val="0"/>
-                <w:color w:val="000000"/>
-                <w:sz w:val="18"/>
-              </w:rPr>
-              <w:t>☐   Very Useful</w:t>
-              <w:tab/>
-              <w:t>☐   Useful</w:t>
-              <w:tab/>
-              <w:t>☐   Moderately Useful</w:t>
-              <w:tab/>
-              <w:t>☐   Not Useful at All</w:t>
-            </w:r>
-          </w:p>
-        </w:tc>
-      </w:tr>
-      <w:tr>
-        <w:tc>
-          <w:tcPr>
-            <w:tcW w:type="dxa" w:w="10426"/>
-            <w:tcMar>
-              <w:top w:w="90" w:type="dxa"/>
-              <w:left w:w="120" w:type="dxa"/>
-              <w:bottom w:w="90" w:type="dxa"/>
-              <w:right w:w="120" w:type="dxa"/>
-            </w:tcMar>
-          </w:tcPr>
-          <w:p>
-            <w:pPr>
-              <w:spacing w:after="120" w:before="60"/>
-            </w:pPr>
-            <w:r/>
-            <w:r>
-              <w:rPr>
-                <w:rFonts w:ascii="Times New Roman" w:hAnsi="Times New Roman" w:eastAsia="Times New Roman"/>
-                <w:b/>
-                <w:color w:val="000000"/>
-                <w:sz w:val="20"/>
-              </w:rPr>
-              <w:t>5. How useful would real-time Telegram alerts be for depot staff when crowding becomes CRITICAL?</w:t>
-            </w:r>
-          </w:p>
-          <w:p>
-            <w:pPr>
-              <w:tabs>
-                <w:tab w:pos="0" w:val="left"/>
-                <w:tab w:pos="2574" w:val="left"/>
-                <w:tab w:pos="5148" w:val="left"/>
-                <w:tab w:pos="7722" w:val="left"/>
-              </w:tabs>
-              <w:spacing w:before="80" w:after="80" w:line="276" w:lineRule="auto"/>
-            </w:pPr>
-            <w:r>
-              <w:rPr>
-                <w:rFonts w:ascii="Times New Roman" w:hAnsi="Times New Roman" w:eastAsia="Times New Roman"/>
-                <w:b w:val="0"/>
-                <w:color w:val="000000"/>
-                <w:sz w:val="18"/>
-              </w:rPr>
-              <w:t>☐   Very Useful</w:t>
-              <w:tab/>
-              <w:t>☐   Useful</w:t>
-              <w:tab/>
-              <w:t>☐   Moderately Useful</w:t>
-              <w:tab/>
-              <w:t>☐   Not Useful at All</w:t>
-            </w:r>
-          </w:p>
-        </w:tc>
-      </w:tr>
-      <w:tr>
-        <w:tc>
-          <w:tcPr>
-            <w:tcW w:type="dxa" w:w="10426"/>
-            <w:tcMar>
-              <w:top w:w="90" w:type="dxa"/>
-              <w:left w:w="120" w:type="dxa"/>
-              <w:bottom w:w="90" w:type="dxa"/>
-              <w:right w:w="120" w:type="dxa"/>
-            </w:tcMar>
-          </w:tcPr>
-          <w:p>
-            <w:pPr>
-              <w:spacing w:after="120" w:before="60"/>
-            </w:pPr>
-            <w:r/>
-            <w:r>
-              <w:rPr>
-                <w:rFonts w:ascii="Times New Roman" w:hAnsi="Times New Roman" w:eastAsia="Times New Roman"/>
-                <w:b/>
-                <w:color w:val="000000"/>
-                <w:sz w:val="20"/>
-              </w:rPr>
-              <w:t>6. How easy was it to understand the crowding information shown on the dashboard (count, weather, risk, status)?</w:t>
-            </w:r>
-          </w:p>
-          <w:p>
-            <w:pPr>
-              <w:tabs>
-                <w:tab w:pos="0" w:val="left"/>
-                <w:tab w:pos="2574" w:val="left"/>
-                <w:tab w:pos="5148" w:val="left"/>
-                <w:tab w:pos="7722" w:val="left"/>
-              </w:tabs>
-              <w:spacing w:before="80" w:after="80" w:line="276" w:lineRule="auto"/>
-            </w:pPr>
-            <w:r>
-              <w:rPr>
-                <w:rFonts w:ascii="Times New Roman" w:hAnsi="Times New Roman" w:eastAsia="Times New Roman"/>
-                <w:b w:val="0"/>
-                <w:color w:val="000000"/>
-                <w:sz w:val="18"/>
-              </w:rPr>
-              <w:t>☐   Very Easy</w:t>
-              <w:tab/>
-              <w:t>☐   Easy</w:t>
-              <w:tab/>
-              <w:t>☐   Neutral</w:t>
-              <w:tab/>
-              <w:t>☐   Difficult</w:t>
-            </w:r>
-          </w:p>
-        </w:tc>
-      </w:tr>
-      <w:tr>
-        <w:tc>
-          <w:tcPr>
-            <w:tcW w:type="dxa" w:w="10426"/>
-            <w:tcMar>
-              <w:top w:w="90" w:type="dxa"/>
-              <w:left w:w="120" w:type="dxa"/>
-              <w:bottom w:w="90" w:type="dxa"/>
-              <w:right w:w="120" w:type="dxa"/>
-            </w:tcMar>
-          </w:tcPr>
-          <w:p>
-            <w:pPr>
-              <w:spacing w:after="120" w:before="60"/>
-            </w:pPr>
-            <w:r/>
-            <w:r>
-              <w:rPr>
-                <w:rFonts w:ascii="Times New Roman" w:hAnsi="Times New Roman" w:eastAsia="Times New Roman"/>
-                <w:b/>
-                <w:color w:val="000000"/>
-                <w:sz w:val="20"/>
-              </w:rPr>
-              <w:t>7. How clearly did the hardware demonstration show how the sensor detects passenger crossings?</w:t>
-            </w:r>
-          </w:p>
-          <w:p>
-            <w:pPr>
-              <w:tabs>
-                <w:tab w:pos="0" w:val="left"/>
-                <w:tab w:pos="2574" w:val="left"/>
-                <w:tab w:pos="5148" w:val="left"/>
-                <w:tab w:pos="7722" w:val="left"/>
-              </w:tabs>
-              <w:spacing w:before="80" w:after="80" w:line="276" w:lineRule="auto"/>
-            </w:pPr>
-            <w:r>
-              <w:rPr>
-                <w:rFonts w:ascii="Times New Roman" w:hAnsi="Times New Roman" w:eastAsia="Times New Roman"/>
-                <w:b w:val="0"/>
-                <w:color w:val="000000"/>
-                <w:sz w:val="18"/>
-              </w:rPr>
-              <w:t>☐   Very Clear</w:t>
-              <w:tab/>
-              <w:t>☐   Clear</w:t>
-              <w:tab/>
-              <w:t>☐   Neutral</w:t>
-              <w:tab/>
-              <w:t>☐   Unclear</w:t>
-            </w:r>
-          </w:p>
-        </w:tc>
-      </w:tr>
-      <w:tr>
-        <w:tc>
-          <w:tcPr>
-            <w:tcW w:type="dxa" w:w="10426"/>
-            <w:tcMar>
-              <w:top w:w="90" w:type="dxa"/>
-              <w:left w:w="120" w:type="dxa"/>
-              <w:bottom w:w="90" w:type="dxa"/>
-              <w:right w:w="120" w:type="dxa"/>
-            </w:tcMar>
-          </w:tcPr>
-          <w:p>
-            <w:pPr>
-              <w:spacing w:after="120" w:before="60"/>
-            </w:pPr>
-            <w:r/>
-            <w:r>
-              <w:rPr>
-                <w:rFonts w:ascii="Times New Roman" w:hAnsi="Times New Roman" w:eastAsia="Times New Roman"/>
-                <w:b/>
-                <w:color w:val="000000"/>
-                <w:sz w:val="20"/>
-              </w:rPr>
-              <w:t>8. How confident are you that this system can warn of overcrowding faster than manual visual guessing?</w:t>
-            </w:r>
-          </w:p>
-          <w:p>
-            <w:pPr>
-              <w:tabs>
-                <w:tab w:pos="0" w:val="left"/>
-                <w:tab w:pos="2574" w:val="left"/>
-                <w:tab w:pos="5148" w:val="left"/>
-                <w:tab w:pos="7722" w:val="left"/>
-              </w:tabs>
-              <w:spacing w:before="80" w:after="80" w:line="276" w:lineRule="auto"/>
-            </w:pPr>
-            <w:r>
-              <w:rPr>
-                <w:rFonts w:ascii="Times New Roman" w:hAnsi="Times New Roman" w:eastAsia="Times New Roman"/>
-                <w:b w:val="0"/>
-                <w:color w:val="000000"/>
-                <w:sz w:val="18"/>
-              </w:rPr>
-              <w:t>☐   Very Confident</w:t>
-              <w:tab/>
-              <w:t>☐   Confident</w:t>
-              <w:tab/>
-              <w:t>☐   Moderately Confident</w:t>
-              <w:tab/>
-              <w:t>☐   Slightly Confident</w:t>
-            </w:r>
-          </w:p>
-        </w:tc>
-      </w:tr>
-      <w:tr>
-        <w:tc>
-          <w:tcPr>
-            <w:tcW w:type="dxa" w:w="10426"/>
-            <w:tcMar>
-              <w:top w:w="90" w:type="dxa"/>
-              <w:left w:w="120" w:type="dxa"/>
-              <w:bottom w:w="90" w:type="dxa"/>
-              <w:right w:w="120" w:type="dxa"/>
-            </w:tcMar>
-          </w:tcPr>
-          <w:p>
-            <w:pPr>
-              <w:spacing w:after="120" w:before="60"/>
-            </w:pPr>
-            <w:r/>
-            <w:r>
-              <w:rPr>
-                <w:rFonts w:ascii="Times New Roman" w:hAnsi="Times New Roman" w:eastAsia="Times New Roman"/>
-                <w:b/>
-                <w:color w:val="000000"/>
-                <w:sz w:val="20"/>
-              </w:rPr>
-              <w:t>9. Would you be willing to use this system if it remained available at Dindoshi Route 326?</w:t>
-            </w:r>
-          </w:p>
-          <w:p>
-            <w:pPr>
-              <w:tabs>
-                <w:tab w:pos="0" w:val="left"/>
-                <w:tab w:pos="2574" w:val="left"/>
-                <w:tab w:pos="5148" w:val="left"/>
-                <w:tab w:pos="7722" w:val="left"/>
-              </w:tabs>
-              <w:spacing w:before="80" w:after="80" w:line="276" w:lineRule="auto"/>
-            </w:pPr>
-            <w:r>
-              <w:rPr>
-                <w:rFonts w:ascii="Times New Roman" w:hAnsi="Times New Roman" w:eastAsia="Times New Roman"/>
-                <w:b w:val="0"/>
-                <w:color w:val="000000"/>
-                <w:sz w:val="18"/>
-              </w:rPr>
-              <w:t>☐   Definitely Yes</w:t>
-              <w:tab/>
-              <w:t>☐   Probably Yes</w:t>
-              <w:tab/>
-              <w:t>☐   Not Sure</w:t>
-              <w:tab/>
-              <w:t>☐   Definitely No</w:t>
-            </w:r>
-          </w:p>
-        </w:tc>
-      </w:tr>
-      <w:tr>
-        <w:tc>
-          <w:tcPr>
-            <w:tcW w:type="dxa" w:w="10426"/>
-            <w:tcMar>
-              <w:top w:w="90" w:type="dxa"/>
-              <w:left w:w="120" w:type="dxa"/>
-              <w:bottom w:w="90" w:type="dxa"/>
-              <w:right w:w="120" w:type="dxa"/>
-            </w:tcMar>
-          </w:tcPr>
-          <w:p>
-            <w:pPr>
-              <w:spacing w:after="120" w:before="60"/>
-            </w:pPr>
-            <w:r/>
-            <w:r>
-              <w:rPr>
-                <w:rFonts w:ascii="Times New Roman" w:hAnsi="Times New Roman" w:eastAsia="Times New Roman"/>
-                <w:b/>
-                <w:color w:val="000000"/>
-                <w:sz w:val="20"/>
-              </w:rPr>
-              <w:t>10. How clear and easy to understand were the NORMAL, WARNING, and CRITICAL status lights?</w:t>
-            </w:r>
-          </w:p>
-          <w:p>
-            <w:pPr>
-              <w:tabs>
-                <w:tab w:pos="0" w:val="left"/>
-                <w:tab w:pos="2574" w:val="left"/>
-                <w:tab w:pos="5148" w:val="left"/>
-                <w:tab w:pos="7722" w:val="left"/>
-              </w:tabs>
-              <w:spacing w:before="80" w:after="80" w:line="276" w:lineRule="auto"/>
-            </w:pPr>
-            <w:r>
-              <w:rPr>
-                <w:rFonts w:ascii="Times New Roman" w:hAnsi="Times New Roman" w:eastAsia="Times New Roman"/>
-                <w:b w:val="0"/>
-                <w:color w:val="000000"/>
-                <w:sz w:val="18"/>
-              </w:rPr>
-              <w:t>☐   Very Clear</w:t>
-              <w:tab/>
-              <w:t>☐   Clear</w:t>
-              <w:tab/>
-              <w:t>☐   Neutral</w:t>
-              <w:tab/>
-              <w:t>☐   Unclear</w:t>
-            </w:r>
-          </w:p>
-        </w:tc>
-      </w:tr>
-      <w:tr>
-        <w:tc>
-          <w:tcPr>
-            <w:tcW w:type="dxa" w:w="10426"/>
-            <w:tcMar>
-              <w:top w:w="90" w:type="dxa"/>
-              <w:left w:w="120" w:type="dxa"/>
-              <w:bottom w:w="90" w:type="dxa"/>
-              <w:right w:w="120" w:type="dxa"/>
-            </w:tcMar>
-          </w:tcPr>
-          <w:p>
-            <w:pPr>
-              <w:spacing w:after="120" w:before="60"/>
-            </w:pPr>
-            <w:r/>
-            <w:r>
-              <w:rPr>
-                <w:rFonts w:ascii="Times New Roman" w:hAnsi="Times New Roman" w:eastAsia="Times New Roman"/>
-                <w:b/>
-                <w:color w:val="000000"/>
-                <w:sz w:val="20"/>
-              </w:rPr>
-              <w:t>11. How useful do you think this system would be for improving crowding awareness at your bus stop?</w:t>
-            </w:r>
-          </w:p>
-          <w:p>
-            <w:pPr>
-              <w:tabs>
-                <w:tab w:pos="0" w:val="left"/>
-                <w:tab w:pos="2574" w:val="left"/>
-                <w:tab w:pos="5148" w:val="left"/>
-                <w:tab w:pos="7722" w:val="left"/>
-              </w:tabs>
-              <w:spacing w:before="80" w:after="80" w:line="276" w:lineRule="auto"/>
-            </w:pPr>
-            <w:r>
-              <w:rPr>
-                <w:rFonts w:ascii="Times New Roman" w:hAnsi="Times New Roman" w:eastAsia="Times New Roman"/>
-                <w:b w:val="0"/>
-                <w:color w:val="000000"/>
-                <w:sz w:val="18"/>
-              </w:rPr>
-              <w:t>☐   Very Useful</w:t>
-              <w:tab/>
-              <w:t>☐   Useful</w:t>
-              <w:tab/>
-              <w:t>☐   Moderately Useful</w:t>
-              <w:tab/>
-              <w:t>☐   Not Useful at All</w:t>
-            </w:r>
-          </w:p>
-        </w:tc>
-      </w:tr>
-      <w:tr>
-        <w:tc>
-          <w:tcPr>
-            <w:tcW w:type="dxa" w:w="10426"/>
-            <w:tcMar>
-              <w:top w:w="90" w:type="dxa"/>
-              <w:left w:w="120" w:type="dxa"/>
-              <w:bottom w:w="90" w:type="dxa"/>
-              <w:right w:w="120" w:type="dxa"/>
-            </w:tcMar>
-          </w:tcPr>
-          <w:p>
-            <w:pPr>
-              <w:spacing w:after="120" w:before="60"/>
-            </w:pPr>
-            <w:r/>
-            <w:r>
-              <w:rPr>
-                <w:rFonts w:ascii="Times New Roman" w:hAnsi="Times New Roman" w:eastAsia="Times New Roman"/>
-                <w:b/>
-                <w:color w:val="000000"/>
-                <w:sz w:val="20"/>
-              </w:rPr>
-              <w:t>12. Overall, how satisfied are you with the IoT bus-stop overcrowding system and its potential for commuter safety?</w:t>
-            </w:r>
-          </w:p>
-          <w:p>
-            <w:pPr>
-              <w:tabs>
-                <w:tab w:pos="0" w:val="left"/>
-                <w:tab w:pos="2574" w:val="left"/>
-                <w:tab w:pos="5148" w:val="left"/>
-                <w:tab w:pos="7722" w:val="left"/>
-              </w:tabs>
-              <w:spacing w:before="80" w:after="80" w:line="276" w:lineRule="auto"/>
-            </w:pPr>
-            <w:r>
-              <w:rPr>
-                <w:rFonts w:ascii="Times New Roman" w:hAnsi="Times New Roman" w:eastAsia="Times New Roman"/>
-                <w:b w:val="0"/>
-                <w:color w:val="000000"/>
-                <w:sz w:val="18"/>
-              </w:rPr>
-              <w:t>☐   Very Satisfied</w:t>
-              <w:tab/>
-              <w:t>☐   Satisfied</w:t>
-              <w:tab/>
-              <w:t>☐   Neutral</w:t>
-              <w:tab/>
-              <w:t>☐   Dissatisfied</w:t>
-            </w:r>
-          </w:p>
-        </w:tc>
-      </w:tr>
-    </w:tbl>
     <w:sectPr>
-      <w:footerReference w:type="default" r:id="rId9"/>
       <w:pgSz w:w="12240" w:h="15840"/>
-      <w:pgMar w:top="794" w:right="907" w:bottom="907" w:left="907" w:header="720" w:footer="720" w:gutter="0"/>
+      <w:pgMar w:top="0" w:right="0" w:bottom="0" w:left="0" w:header="720" w:footer="720" w:gutter="0"/>
       <w:cols w:space="720"/>
       <w:docGrid w:linePitch="360"/>
-      <w:pgNumType w:start="95"/>
     </w:sectPr>
   </w:body>
 </w:document>
-</file>
-
-<file path=word/footer1.xml><?xml version="1.0" encoding="utf-8"?>
-<w:ftr xmlns:m="http://schemas.openxmlformats.org/officeDocument/2006/math" xmlns:mc="http://schemas.openxmlformats.org/markup-compatibility/2006" xmlns:mo="http://schemas.microsoft.com/office/mac/office/2008/main" xmlns:mv="urn:schemas-microsoft-com:mac:vml" xmlns:o="urn:schemas-microsoft-com:office:office" xmlns:r="http://schemas.openxmlformats.org/officeDocument/2006/relationships" xmlns:v="urn:schemas-microsoft-com:vml" xmlns:w10="urn:schemas-microsoft-com:office:word" xmlns:w14="http://schemas.microsoft.com/office/word/2010/wordml" xmlns:w="http://schemas.openxmlformats.org/wordprocessingml/2006/main" xmlns:wne="http://schemas.microsoft.com/office/word/2006/wordml" xmlns:wp14="http://schemas.microsoft.com/office/word/2010/wordprocessingDrawing" xmlns:wp="http://schemas.openxmlformats.org/drawingml/2006/wordprocessingDrawing" xmlns:wpc="http://schemas.microsoft.com/office/word/2010/wordprocessingCanvas" xmlns:wpg="http://schemas.microsoft.com/office/word/2010/wordprocessingGroup" xmlns:wpi="http://schemas.microsoft.com/office/word/2010/wordprocessingInk" xmlns:wps="http://schemas.microsoft.com/office/word/2010/wordprocessingShape" mc:Ignorable="w14 wp14">
-  <w:p>
-    <w:pPr>
-      <w:pStyle w:val="Footer"/>
-      <w:jc w:val="center"/>
-    </w:pPr>
-    <w:r>
-      <w:rPr>
-        <w:rFonts w:ascii="Times New Roman" w:hAnsi="Times New Roman" w:eastAsia="Times New Roman"/>
-        <w:b w:val="0"/>
-        <w:color w:val="000000"/>
-        <w:sz w:val="24"/>
-      </w:rPr>
-      <w:fldChar w:fldCharType="begin"/>
-      <w:instrText xml:space="preserve"> PAGE </w:instrText>
-      <w:fldChar w:fldCharType="end"/>
-    </w:r>
-  </w:p>
-</w:ftr>
 </file>
 
 <file path=word/numbering.xml><?xml version="1.0" encoding="utf-8"?>

</xml_diff>